<commit_message>
Waiting to be finalize checked
</commit_message>
<xml_diff>
--- a/docs/team_meeting_minutes.docx
+++ b/docs/team_meeting_minutes.docx
@@ -74,8 +74,16 @@
               <w:rPr>
                 <w:lang w:val="en-US"/>
               </w:rPr>
-              <w:t>Date and Time</w:t>
-            </w:r>
+              <w:t xml:space="preserve">Date and </w:t>
+            </w:r>
+            <w:proofErr w:type="gramStart"/>
+            <w:r>
+              <w:rPr>
+                <w:lang w:val="en-US"/>
+              </w:rPr>
+              <w:t>Time</w:t>
+            </w:r>
+            <w:proofErr w:type="gramEnd"/>
           </w:p>
         </w:tc>
         <w:tc>
@@ -111,7 +119,19 @@
               <w:rPr>
                 <w:lang w:val="en-US"/>
               </w:rPr>
-              <w:t xml:space="preserve"> October 2016, 12 PM </w:t>
+              <w:t xml:space="preserve"> October 20</w:t>
+            </w:r>
+            <w:r>
+              <w:rPr>
+                <w:lang w:val="en-US"/>
+              </w:rPr>
+              <w:t>2</w:t>
+            </w:r>
+            <w:r>
+              <w:rPr>
+                <w:lang w:val="en-US"/>
+              </w:rPr>
+              <w:t xml:space="preserve">6, 12 PM </w:t>
             </w:r>
             <w:r>
               <w:rPr>
@@ -231,11 +251,19 @@
                 <w:lang w:val="en-US"/>
               </w:rPr>
             </w:pPr>
-            <w:r>
-              <w:rPr>
-                <w:lang w:val="en-US"/>
-              </w:rPr>
-              <w:t xml:space="preserve">Hangyeon Cho, </w:t>
+            <w:proofErr w:type="spellStart"/>
+            <w:r>
+              <w:rPr>
+                <w:lang w:val="en-US"/>
+              </w:rPr>
+              <w:t>Hangyeon</w:t>
+            </w:r>
+            <w:proofErr w:type="spellEnd"/>
+            <w:r>
+              <w:rPr>
+                <w:lang w:val="en-US"/>
+              </w:rPr>
+              <w:t xml:space="preserve"> Cho, </w:t>
             </w:r>
           </w:p>
           <w:p>
@@ -253,7 +281,21 @@
               <w:rPr>
                 <w:lang w:val="en-US"/>
               </w:rPr>
-              <w:t xml:space="preserve">Glenny Vaneesha, </w:t>
+              <w:t xml:space="preserve">Glenny </w:t>
+            </w:r>
+            <w:proofErr w:type="spellStart"/>
+            <w:r>
+              <w:rPr>
+                <w:lang w:val="en-US"/>
+              </w:rPr>
+              <w:t>Vennesha</w:t>
+            </w:r>
+            <w:proofErr w:type="spellEnd"/>
+            <w:r>
+              <w:rPr>
+                <w:lang w:val="en-US"/>
+              </w:rPr>
+              <w:t xml:space="preserve">, </w:t>
             </w:r>
             <w:r>
               <w:rPr>
@@ -304,12 +346,14 @@
                 <w:lang w:val="en-US"/>
               </w:rPr>
             </w:pPr>
+            <w:proofErr w:type="spellStart"/>
             <w:r>
               <w:rPr>
                 <w:lang w:val="en-US"/>
               </w:rPr>
               <w:t>Organiser</w:t>
             </w:r>
+            <w:proofErr w:type="spellEnd"/>
           </w:p>
         </w:tc>
         <w:tc>
@@ -671,7 +715,21 @@
               <w:rPr>
                 <w:lang w:val="en-US"/>
               </w:rPr>
-              <w:t>Create Introduction to Lama Lama Country and Background Research</w:t>
+              <w:t xml:space="preserve">Create Introduction to Lama </w:t>
+            </w:r>
+            <w:proofErr w:type="spellStart"/>
+            <w:r>
+              <w:rPr>
+                <w:lang w:val="en-US"/>
+              </w:rPr>
+              <w:t>Lama</w:t>
+            </w:r>
+            <w:proofErr w:type="spellEnd"/>
+            <w:r>
+              <w:rPr>
+                <w:lang w:val="en-US"/>
+              </w:rPr>
+              <w:t xml:space="preserve"> Country and Background Research</w:t>
             </w:r>
           </w:p>
         </w:tc>
@@ -789,8 +847,16 @@
               <w:rPr>
                 <w:lang w:val="en-US"/>
               </w:rPr>
-              <w:t>Glenny Vaneesha</w:t>
-            </w:r>
+              <w:t xml:space="preserve">Glenny </w:t>
+            </w:r>
+            <w:proofErr w:type="spellStart"/>
+            <w:r>
+              <w:rPr>
+                <w:lang w:val="en-US"/>
+              </w:rPr>
+              <w:t>Vennesha</w:t>
+            </w:r>
+            <w:proofErr w:type="spellEnd"/>
           </w:p>
         </w:tc>
         <w:tc>
@@ -971,11 +1037,19 @@
                 <w:lang w:val="en-US"/>
               </w:rPr>
             </w:pPr>
-            <w:r>
-              <w:rPr>
-                <w:lang w:val="en-US"/>
-              </w:rPr>
-              <w:t>Hangyeon Cho</w:t>
+            <w:proofErr w:type="spellStart"/>
+            <w:r>
+              <w:rPr>
+                <w:lang w:val="en-US"/>
+              </w:rPr>
+              <w:t>Hangyeon</w:t>
+            </w:r>
+            <w:proofErr w:type="spellEnd"/>
+            <w:r>
+              <w:rPr>
+                <w:lang w:val="en-US"/>
+              </w:rPr>
+              <w:t xml:space="preserve"> Cho</w:t>
             </w:r>
           </w:p>
         </w:tc>
@@ -1392,7 +1466,21 @@
         <w:rPr>
           <w:lang w:val="en-US"/>
         </w:rPr>
-        <w:t>The group agreed to use a consistent visual theme and formatting across all website pages.</w:t>
+        <w:t xml:space="preserve">The group agreed to use a consistent visual theme and </w:t>
+      </w:r>
+      <w:proofErr w:type="gramStart"/>
+      <w:r>
+        <w:rPr>
+          <w:lang w:val="en-US"/>
+        </w:rPr>
+        <w:t>formatting</w:t>
+      </w:r>
+      <w:proofErr w:type="gramEnd"/>
+      <w:r>
+        <w:rPr>
+          <w:lang w:val="en-US"/>
+        </w:rPr>
+        <w:t xml:space="preserve"> across all website pages.</w:t>
       </w:r>
     </w:p>
     <w:p>
@@ -1514,8 +1602,16 @@
               <w:rPr>
                 <w:lang w:val="en-US"/>
               </w:rPr>
-              <w:t>Date and Time</w:t>
-            </w:r>
+              <w:t xml:space="preserve">Date and </w:t>
+            </w:r>
+            <w:proofErr w:type="gramStart"/>
+            <w:r>
+              <w:rPr>
+                <w:lang w:val="en-US"/>
+              </w:rPr>
+              <w:t>Time</w:t>
+            </w:r>
+            <w:proofErr w:type="gramEnd"/>
           </w:p>
         </w:tc>
         <w:tc>
@@ -1683,11 +1779,19 @@
                 <w:lang w:val="en-US"/>
               </w:rPr>
             </w:pPr>
-            <w:r>
-              <w:rPr>
-                <w:lang w:val="en-US"/>
-              </w:rPr>
-              <w:t xml:space="preserve">Hangyeon Cho, </w:t>
+            <w:proofErr w:type="spellStart"/>
+            <w:r>
+              <w:rPr>
+                <w:lang w:val="en-US"/>
+              </w:rPr>
+              <w:t>Hangyeon</w:t>
+            </w:r>
+            <w:proofErr w:type="spellEnd"/>
+            <w:r>
+              <w:rPr>
+                <w:lang w:val="en-US"/>
+              </w:rPr>
+              <w:t xml:space="preserve"> Cho, </w:t>
             </w:r>
           </w:p>
           <w:p>
@@ -1705,7 +1809,21 @@
               <w:rPr>
                 <w:lang w:val="en-US"/>
               </w:rPr>
-              <w:t xml:space="preserve">Glenny Vaneesha, </w:t>
+              <w:t xml:space="preserve">Glenny </w:t>
+            </w:r>
+            <w:proofErr w:type="spellStart"/>
+            <w:r>
+              <w:rPr>
+                <w:lang w:val="en-US"/>
+              </w:rPr>
+              <w:t>Vennesha</w:t>
+            </w:r>
+            <w:proofErr w:type="spellEnd"/>
+            <w:r>
+              <w:rPr>
+                <w:lang w:val="en-US"/>
+              </w:rPr>
+              <w:t xml:space="preserve">, </w:t>
             </w:r>
             <w:r>
               <w:rPr>
@@ -1756,12 +1874,14 @@
                 <w:lang w:val="en-US"/>
               </w:rPr>
             </w:pPr>
+            <w:proofErr w:type="spellStart"/>
             <w:r>
               <w:rPr>
                 <w:lang w:val="en-US"/>
               </w:rPr>
               <w:t>Organiser</w:t>
             </w:r>
+            <w:proofErr w:type="spellEnd"/>
           </w:p>
         </w:tc>
         <w:tc>
@@ -1837,8 +1957,16 @@
               <w:rPr>
                 <w:lang w:val="en-US"/>
               </w:rPr>
-              <w:t>Glenny Veneesha</w:t>
-            </w:r>
+              <w:t xml:space="preserve">Glenny </w:t>
+            </w:r>
+            <w:proofErr w:type="spellStart"/>
+            <w:r>
+              <w:rPr>
+                <w:lang w:val="en-US"/>
+              </w:rPr>
+              <w:t>Veneesha</w:t>
+            </w:r>
+            <w:proofErr w:type="spellEnd"/>
           </w:p>
         </w:tc>
       </w:tr>
@@ -2272,8 +2400,16 @@
               <w:rPr>
                 <w:lang w:val="en-US"/>
               </w:rPr>
-              <w:t>Glenny Vaneesha</w:t>
-            </w:r>
+              <w:t xml:space="preserve">Glenny </w:t>
+            </w:r>
+            <w:proofErr w:type="spellStart"/>
+            <w:r>
+              <w:rPr>
+                <w:lang w:val="en-US"/>
+              </w:rPr>
+              <w:t>Vennesha</w:t>
+            </w:r>
+            <w:proofErr w:type="spellEnd"/>
           </w:p>
         </w:tc>
         <w:tc>
@@ -2479,11 +2615,19 @@
                 <w:lang w:val="en-US"/>
               </w:rPr>
             </w:pPr>
-            <w:r>
-              <w:rPr>
-                <w:lang w:val="en-US"/>
-              </w:rPr>
-              <w:t>Hangyeon Cho</w:t>
+            <w:proofErr w:type="spellStart"/>
+            <w:r>
+              <w:rPr>
+                <w:lang w:val="en-US"/>
+              </w:rPr>
+              <w:t>Hangyeon</w:t>
+            </w:r>
+            <w:proofErr w:type="spellEnd"/>
+            <w:r>
+              <w:rPr>
+                <w:lang w:val="en-US"/>
+              </w:rPr>
+              <w:t xml:space="preserve"> Cho</w:t>
             </w:r>
           </w:p>
         </w:tc>
@@ -2983,8 +3127,16 @@
               <w:rPr>
                 <w:lang w:val="en-US"/>
               </w:rPr>
-              <w:t>Date and Time</w:t>
-            </w:r>
+              <w:t xml:space="preserve">Date and </w:t>
+            </w:r>
+            <w:proofErr w:type="gramStart"/>
+            <w:r>
+              <w:rPr>
+                <w:lang w:val="en-US"/>
+              </w:rPr>
+              <w:t>Time</w:t>
+            </w:r>
+            <w:proofErr w:type="gramEnd"/>
           </w:p>
         </w:tc>
         <w:tc>
@@ -3008,7 +3160,19 @@
               <w:rPr>
                 <w:lang w:val="en-US"/>
               </w:rPr>
-              <w:t xml:space="preserve">28 October 2016, </w:t>
+              <w:t>28 October 20</w:t>
+            </w:r>
+            <w:r>
+              <w:rPr>
+                <w:lang w:val="en-US"/>
+              </w:rPr>
+              <w:t>2</w:t>
+            </w:r>
+            <w:r>
+              <w:rPr>
+                <w:lang w:val="en-US"/>
+              </w:rPr>
+              <w:t xml:space="preserve">6, </w:t>
             </w:r>
             <w:r>
               <w:rPr>
@@ -3152,11 +3316,19 @@
                 <w:lang w:val="en-US"/>
               </w:rPr>
             </w:pPr>
-            <w:r>
-              <w:rPr>
-                <w:lang w:val="en-US"/>
-              </w:rPr>
-              <w:t xml:space="preserve">Hangyeon Cho, </w:t>
+            <w:proofErr w:type="spellStart"/>
+            <w:r>
+              <w:rPr>
+                <w:lang w:val="en-US"/>
+              </w:rPr>
+              <w:t>Hangyeon</w:t>
+            </w:r>
+            <w:proofErr w:type="spellEnd"/>
+            <w:r>
+              <w:rPr>
+                <w:lang w:val="en-US"/>
+              </w:rPr>
+              <w:t xml:space="preserve"> Cho, </w:t>
             </w:r>
           </w:p>
           <w:p>
@@ -3174,7 +3346,21 @@
               <w:rPr>
                 <w:lang w:val="en-US"/>
               </w:rPr>
-              <w:t xml:space="preserve">Glenny Vaneesha, </w:t>
+              <w:t xml:space="preserve">Glenny </w:t>
+            </w:r>
+            <w:proofErr w:type="spellStart"/>
+            <w:r>
+              <w:rPr>
+                <w:lang w:val="en-US"/>
+              </w:rPr>
+              <w:t>Vennesha</w:t>
+            </w:r>
+            <w:proofErr w:type="spellEnd"/>
+            <w:r>
+              <w:rPr>
+                <w:lang w:val="en-US"/>
+              </w:rPr>
+              <w:t xml:space="preserve">, </w:t>
             </w:r>
             <w:r>
               <w:rPr>
@@ -3225,12 +3411,14 @@
                 <w:lang w:val="en-US"/>
               </w:rPr>
             </w:pPr>
+            <w:proofErr w:type="spellStart"/>
             <w:r>
               <w:rPr>
                 <w:lang w:val="en-US"/>
               </w:rPr>
               <w:t>Organiser</w:t>
             </w:r>
+            <w:proofErr w:type="spellEnd"/>
           </w:p>
         </w:tc>
         <w:tc>
@@ -4388,27 +4576,9 @@
   </w:abstractNum>
   <w:num w:numId="1" w16cid:durableId="949312381">
     <w:abstractNumId w:val="0"/>
-    <w:lvlOverride w:ilvl="0"/>
-    <w:lvlOverride w:ilvl="1"/>
-    <w:lvlOverride w:ilvl="2"/>
-    <w:lvlOverride w:ilvl="3"/>
-    <w:lvlOverride w:ilvl="4"/>
-    <w:lvlOverride w:ilvl="5"/>
-    <w:lvlOverride w:ilvl="6"/>
-    <w:lvlOverride w:ilvl="7"/>
-    <w:lvlOverride w:ilvl="8"/>
   </w:num>
   <w:num w:numId="2" w16cid:durableId="1140921896">
     <w:abstractNumId w:val="5"/>
-    <w:lvlOverride w:ilvl="0"/>
-    <w:lvlOverride w:ilvl="1"/>
-    <w:lvlOverride w:ilvl="2"/>
-    <w:lvlOverride w:ilvl="3"/>
-    <w:lvlOverride w:ilvl="4"/>
-    <w:lvlOverride w:ilvl="5"/>
-    <w:lvlOverride w:ilvl="6"/>
-    <w:lvlOverride w:ilvl="7"/>
-    <w:lvlOverride w:ilvl="8"/>
   </w:num>
   <w:num w:numId="3" w16cid:durableId="447429391">
     <w:abstractNumId w:val="2"/>
@@ -4442,15 +4612,6 @@
   </w:num>
   <w:num w:numId="4" w16cid:durableId="423653960">
     <w:abstractNumId w:val="6"/>
-    <w:lvlOverride w:ilvl="0"/>
-    <w:lvlOverride w:ilvl="1"/>
-    <w:lvlOverride w:ilvl="2"/>
-    <w:lvlOverride w:ilvl="3"/>
-    <w:lvlOverride w:ilvl="4"/>
-    <w:lvlOverride w:ilvl="5"/>
-    <w:lvlOverride w:ilvl="6"/>
-    <w:lvlOverride w:ilvl="7"/>
-    <w:lvlOverride w:ilvl="8"/>
   </w:num>
   <w:num w:numId="5" w16cid:durableId="2032146281">
     <w:abstractNumId w:val="3"/>
@@ -4484,15 +4645,6 @@
   </w:num>
   <w:num w:numId="6" w16cid:durableId="233246211">
     <w:abstractNumId w:val="4"/>
-    <w:lvlOverride w:ilvl="0"/>
-    <w:lvlOverride w:ilvl="1"/>
-    <w:lvlOverride w:ilvl="2"/>
-    <w:lvlOverride w:ilvl="3"/>
-    <w:lvlOverride w:ilvl="4"/>
-    <w:lvlOverride w:ilvl="5"/>
-    <w:lvlOverride w:ilvl="6"/>
-    <w:lvlOverride w:ilvl="7"/>
-    <w:lvlOverride w:ilvl="8"/>
   </w:num>
   <w:num w:numId="7" w16cid:durableId="1393112288">
     <w:abstractNumId w:val="1"/>
@@ -5103,6 +5255,7 @@
   <w:style w:type="character" w:default="1" w:styleId="DefaultParagraphFont">
     <w:name w:val="Default Paragraph Font"/>
     <w:uiPriority w:val="1"/>
+    <w:semiHidden/>
     <w:unhideWhenUsed/>
   </w:style>
   <w:style w:type="table" w:default="1" w:styleId="TableNormal">
@@ -5563,8 +5716,11 @@
   <w:rsids>
     <w:rsidRoot w:val="00CF64AB"/>
     <w:rsid w:val="003122D8"/>
+    <w:rsid w:val="007A5696"/>
+    <w:rsid w:val="0096416A"/>
     <w:rsid w:val="00CF64AB"/>
     <w:rsid w:val="00D70935"/>
+    <w:rsid w:val="00FF4B5F"/>
   </w:rsids>
   <m:mathPr>
     <m:mathFont m:val="Cambria Math"/>
@@ -6015,18 +6171,6 @@
     <w:semiHidden/>
     <w:unhideWhenUsed/>
   </w:style>
-  <w:style w:type="paragraph" w:customStyle="1" w:styleId="D4E5AFF2C0464CE8A94BFFE348FB8707">
-    <w:name w:val="D4E5AFF2C0464CE8A94BFFE348FB8707"/>
-    <w:rsid w:val="00CF64AB"/>
-  </w:style>
-  <w:style w:type="paragraph" w:customStyle="1" w:styleId="01FCA636B7684E0B8CFE324C759E5837">
-    <w:name w:val="01FCA636B7684E0B8CFE324C759E5837"/>
-    <w:rsid w:val="00CF64AB"/>
-  </w:style>
-  <w:style w:type="paragraph" w:customStyle="1" w:styleId="B3BD349725CF4E978C289E9CDD070C64">
-    <w:name w:val="B3BD349725CF4E978C289E9CDD070C64"/>
-    <w:rsid w:val="00CF64AB"/>
-  </w:style>
   <w:style w:type="paragraph" w:customStyle="1" w:styleId="8132F37F05264D3FBE40530F7361C440">
     <w:name w:val="8132F37F05264D3FBE40530F7361C440"/>
     <w:rsid w:val="00CF64AB"/>

</xml_diff>